<commit_message>
fix(template): alfa v2 - normalize closing-balance spacing + vAlign top (Pack 73.2)
</commit_message>
<xml_diff>
--- a/templates/docx/bank_statement_template_v2.docx
+++ b/templates/docx/bank_statement_template_v2.docx
@@ -1663,7 +1663,7 @@
         <w:tabs>
           <w:tab w:val="right" w:pos="10921"/>
         </w:tabs>
-        <w:spacing w:before="54" w:line="451" w:lineRule="auto"/>
+        <w:spacing w:before="54"/>
         <w:ind w:left="5812"/>
         <w:rPr>
           <w:lang w:val="en-US"/>
@@ -1723,7 +1723,7 @@
           <w:tab w:val="left" w:pos="9812"/>
           <w:tab w:val="left" w:pos="10212"/>
         </w:tabs>
-        <w:spacing w:before="54" w:line="451" w:lineRule="auto"/>
+        <w:spacing w:before="54"/>
         <w:ind w:left="5812" w:right="139"/>
         <w:rPr>
           <w:lang w:val="en-US"/>
@@ -1737,7 +1737,7 @@
           <w:tab w:val="left" w:pos="9812"/>
           <w:tab w:val="left" w:pos="10212"/>
         </w:tabs>
-        <w:spacing w:before="54" w:line="451" w:lineRule="auto"/>
+        <w:spacing w:before="54"/>
         <w:ind w:left="5812" w:right="139"/>
         <w:rPr>
           <w:lang w:val="en-US"/>
@@ -1868,6 +1868,7 @@
             <w:tcBorders>
               <w:bottom w:val="single" w:sz="12" w:space="0" w:color="7E7E7E"/>
             </w:tcBorders>
+            <w:vAlign w:val="top"/>
           </w:tcPr>
           <w:p>
             <w:pPr>
@@ -1906,6 +1907,7 @@
             <w:tcBorders>
               <w:bottom w:val="single" w:sz="12" w:space="0" w:color="7E7E7E"/>
             </w:tcBorders>
+            <w:vAlign w:val="top"/>
           </w:tcPr>
           <w:p>
             <w:pPr>
@@ -1938,6 +1940,7 @@
             <w:tcBorders>
               <w:bottom w:val="single" w:sz="12" w:space="0" w:color="7E7E7E"/>
             </w:tcBorders>
+            <w:vAlign w:val="top"/>
           </w:tcPr>
           <w:p>
             <w:pPr>
@@ -1963,6 +1966,7 @@
             <w:tcBorders>
               <w:bottom w:val="single" w:sz="12" w:space="0" w:color="7E7E7E"/>
             </w:tcBorders>
+            <w:vAlign w:val="top"/>
           </w:tcPr>
           <w:p>
             <w:pPr>
@@ -2039,6 +2043,7 @@
               <w:top w:val="single" w:sz="4" w:space="0" w:color="7E7E7E"/>
               <w:bottom w:val="single" w:sz="4" w:space="0" w:color="7E7E7E"/>
             </w:tcBorders>
+            <w:vAlign w:val="top"/>
           </w:tcPr>
           <w:p>
             <w:pPr>
@@ -2065,6 +2070,7 @@
               <w:top w:val="single" w:sz="4" w:space="0" w:color="7E7E7E"/>
               <w:bottom w:val="single" w:sz="4" w:space="0" w:color="7E7E7E"/>
             </w:tcBorders>
+            <w:vAlign w:val="top"/>
           </w:tcPr>
           <w:p>
             <w:pPr>
@@ -2092,6 +2098,7 @@
               <w:top w:val="single" w:sz="4" w:space="0" w:color="7E7E7E"/>
               <w:bottom w:val="single" w:sz="4" w:space="0" w:color="7E7E7E"/>
             </w:tcBorders>
+            <w:vAlign w:val="top"/>
           </w:tcPr>
           <w:p>
             <w:pPr>
@@ -2119,6 +2126,7 @@
               <w:top w:val="single" w:sz="4" w:space="0" w:color="7E7E7E"/>
               <w:bottom w:val="single" w:sz="4" w:space="0" w:color="7E7E7E"/>
             </w:tcBorders>
+            <w:vAlign w:val="top"/>
           </w:tcPr>
           <w:p>
             <w:pPr>

</xml_diff>

<commit_message>
revert(template): rollback Pack 73.2 alfa v2 fixes
</commit_message>
<xml_diff>
--- a/templates/docx/bank_statement_template_v2.docx
+++ b/templates/docx/bank_statement_template_v2.docx
@@ -1663,7 +1663,7 @@
         <w:tabs>
           <w:tab w:val="right" w:pos="10921"/>
         </w:tabs>
-        <w:spacing w:before="54"/>
+        <w:spacing w:before="54" w:line="451" w:lineRule="auto"/>
         <w:ind w:left="5812"/>
         <w:rPr>
           <w:lang w:val="en-US"/>
@@ -1723,7 +1723,7 @@
           <w:tab w:val="left" w:pos="9812"/>
           <w:tab w:val="left" w:pos="10212"/>
         </w:tabs>
-        <w:spacing w:before="54"/>
+        <w:spacing w:before="54" w:line="451" w:lineRule="auto"/>
         <w:ind w:left="5812" w:right="139"/>
         <w:rPr>
           <w:lang w:val="en-US"/>
@@ -1737,7 +1737,7 @@
           <w:tab w:val="left" w:pos="9812"/>
           <w:tab w:val="left" w:pos="10212"/>
         </w:tabs>
-        <w:spacing w:before="54"/>
+        <w:spacing w:before="54" w:line="451" w:lineRule="auto"/>
         <w:ind w:left="5812" w:right="139"/>
         <w:rPr>
           <w:lang w:val="en-US"/>
@@ -1868,7 +1868,6 @@
             <w:tcBorders>
               <w:bottom w:val="single" w:sz="12" w:space="0" w:color="7E7E7E"/>
             </w:tcBorders>
-            <w:vAlign w:val="top"/>
           </w:tcPr>
           <w:p>
             <w:pPr>
@@ -1907,7 +1906,6 @@
             <w:tcBorders>
               <w:bottom w:val="single" w:sz="12" w:space="0" w:color="7E7E7E"/>
             </w:tcBorders>
-            <w:vAlign w:val="top"/>
           </w:tcPr>
           <w:p>
             <w:pPr>
@@ -1940,7 +1938,6 @@
             <w:tcBorders>
               <w:bottom w:val="single" w:sz="12" w:space="0" w:color="7E7E7E"/>
             </w:tcBorders>
-            <w:vAlign w:val="top"/>
           </w:tcPr>
           <w:p>
             <w:pPr>
@@ -1966,7 +1963,6 @@
             <w:tcBorders>
               <w:bottom w:val="single" w:sz="12" w:space="0" w:color="7E7E7E"/>
             </w:tcBorders>
-            <w:vAlign w:val="top"/>
           </w:tcPr>
           <w:p>
             <w:pPr>
@@ -2043,7 +2039,6 @@
               <w:top w:val="single" w:sz="4" w:space="0" w:color="7E7E7E"/>
               <w:bottom w:val="single" w:sz="4" w:space="0" w:color="7E7E7E"/>
             </w:tcBorders>
-            <w:vAlign w:val="top"/>
           </w:tcPr>
           <w:p>
             <w:pPr>
@@ -2070,7 +2065,6 @@
               <w:top w:val="single" w:sz="4" w:space="0" w:color="7E7E7E"/>
               <w:bottom w:val="single" w:sz="4" w:space="0" w:color="7E7E7E"/>
             </w:tcBorders>
-            <w:vAlign w:val="top"/>
           </w:tcPr>
           <w:p>
             <w:pPr>
@@ -2098,7 +2092,6 @@
               <w:top w:val="single" w:sz="4" w:space="0" w:color="7E7E7E"/>
               <w:bottom w:val="single" w:sz="4" w:space="0" w:color="7E7E7E"/>
             </w:tcBorders>
-            <w:vAlign w:val="top"/>
           </w:tcPr>
           <w:p>
             <w:pPr>
@@ -2126,7 +2119,6 @@
               <w:top w:val="single" w:sz="4" w:space="0" w:color="7E7E7E"/>
               <w:bottom w:val="single" w:sz="4" w:space="0" w:color="7E7E7E"/>
             </w:tcBorders>
-            <w:vAlign w:val="top"/>
           </w:tcPr>
           <w:p>
             <w:pPr>

</xml_diff>

<commit_message>
fix(template): alfa v2 footer NUMPAGES field (Pack 73.4)
</commit_message>
<xml_diff>
--- a/templates/docx/bank_statement_template_v2.docx
+++ b/templates/docx/bank_statement_template_v2.docx
@@ -2772,7 +2772,43 @@
                               <w:spacing w:val="-5"/>
                               <w:sz w:val="16"/>
                             </w:rPr>
+                            <w:fldChar w:fldCharType="begin"/>
+                          </w:r>
+                          <w:r>
+                            <w:rPr>
+                              <w:rFonts w:ascii="Arial" w:hAnsi="Arial"/>
+                              <w:b/>
+                              <w:spacing w:val="-5"/>
+                              <w:sz w:val="16"/>
+                            </w:rPr>
+                            <w:instrText xml:space="preserve"> NUMPAGES </w:instrText>
+                          </w:r>
+                          <w:r>
+                            <w:rPr>
+                              <w:rFonts w:ascii="Arial" w:hAnsi="Arial"/>
+                              <w:b/>
+                              <w:spacing w:val="-5"/>
+                              <w:sz w:val="16"/>
+                            </w:rPr>
+                            <w:fldChar w:fldCharType="separate"/>
+                          </w:r>
+                          <w:r>
+                            <w:rPr>
+                              <w:rFonts w:ascii="Arial" w:hAnsi="Arial"/>
+                              <w:b/>
+                              <w:spacing w:val="-5"/>
+                              <w:sz w:val="16"/>
+                            </w:rPr>
                             <w:t>2</w:t>
+                          </w:r>
+                          <w:r>
+                            <w:rPr>
+                              <w:rFonts w:ascii="Arial" w:hAnsi="Arial"/>
+                              <w:b/>
+                              <w:spacing w:val="-5"/>
+                              <w:sz w:val="16"/>
+                            </w:rPr>
+                            <w:fldChar w:fldCharType="end"/>
                           </w:r>
                         </w:p>
                         <w:p>
@@ -2900,7 +2936,43 @@
                         <w:spacing w:val="-5"/>
                         <w:sz w:val="16"/>
                       </w:rPr>
+                      <w:fldChar w:fldCharType="begin"/>
+                    </w:r>
+                    <w:r>
+                      <w:rPr>
+                        <w:rFonts w:ascii="Arial" w:hAnsi="Arial"/>
+                        <w:b/>
+                        <w:spacing w:val="-5"/>
+                        <w:sz w:val="16"/>
+                      </w:rPr>
+                      <w:instrText xml:space="preserve"> NUMPAGES </w:instrText>
+                    </w:r>
+                    <w:r>
+                      <w:rPr>
+                        <w:rFonts w:ascii="Arial" w:hAnsi="Arial"/>
+                        <w:b/>
+                        <w:spacing w:val="-5"/>
+                        <w:sz w:val="16"/>
+                      </w:rPr>
+                      <w:fldChar w:fldCharType="separate"/>
+                    </w:r>
+                    <w:r>
+                      <w:rPr>
+                        <w:rFonts w:ascii="Arial" w:hAnsi="Arial"/>
+                        <w:b/>
+                        <w:spacing w:val="-5"/>
+                        <w:sz w:val="16"/>
+                      </w:rPr>
                       <w:t>2</w:t>
+                    </w:r>
+                    <w:r>
+                      <w:rPr>
+                        <w:rFonts w:ascii="Arial" w:hAnsi="Arial"/>
+                        <w:b/>
+                        <w:spacing w:val="-5"/>
+                        <w:sz w:val="16"/>
+                      </w:rPr>
+                      <w:fldChar w:fldCharType="end"/>
                     </w:r>
                   </w:p>
                   <w:p>

</xml_diff>

<commit_message>
fix(template): remove 15 trailing empty paragraphs causing blank last page (Pack 73.8)
</commit_message>
<xml_diff>
--- a/templates/docx/bank_statement_template_v2.docx
+++ b/templates/docx/bank_statement_template_v2.docx
@@ -2412,136 +2412,6 @@
         <w:rPr>
           <w:rFonts w:ascii="Arial" w:hAnsi="Arial"/>
           <w:i/>
-          <w:sz w:val="16"/>
-        </w:rPr>
-      </w:pPr>
-    </w:p>
-    <w:p>
-      <w:pPr>
-        <w:rPr>
-          <w:rFonts w:ascii="Arial" w:hAnsi="Arial"/>
-          <w:sz w:val="16"/>
-        </w:rPr>
-      </w:pPr>
-    </w:p>
-    <w:p>
-      <w:pPr>
-        <w:rPr>
-          <w:rFonts w:ascii="Arial" w:hAnsi="Arial"/>
-          <w:sz w:val="16"/>
-        </w:rPr>
-      </w:pPr>
-    </w:p>
-    <w:p>
-      <w:pPr>
-        <w:rPr>
-          <w:rFonts w:ascii="Arial" w:hAnsi="Arial"/>
-          <w:sz w:val="16"/>
-        </w:rPr>
-      </w:pPr>
-    </w:p>
-    <w:p>
-      <w:pPr>
-        <w:rPr>
-          <w:rFonts w:ascii="Arial" w:hAnsi="Arial"/>
-          <w:sz w:val="16"/>
-        </w:rPr>
-      </w:pPr>
-    </w:p>
-    <w:p>
-      <w:pPr>
-        <w:rPr>
-          <w:rFonts w:ascii="Arial" w:hAnsi="Arial"/>
-          <w:sz w:val="16"/>
-        </w:rPr>
-      </w:pPr>
-    </w:p>
-    <w:p>
-      <w:pPr>
-        <w:rPr>
-          <w:rFonts w:ascii="Arial" w:hAnsi="Arial"/>
-          <w:sz w:val="16"/>
-        </w:rPr>
-      </w:pPr>
-    </w:p>
-    <w:p>
-      <w:pPr>
-        <w:rPr>
-          <w:rFonts w:ascii="Arial" w:hAnsi="Arial"/>
-          <w:sz w:val="16"/>
-        </w:rPr>
-      </w:pPr>
-    </w:p>
-    <w:p>
-      <w:pPr>
-        <w:tabs>
-          <w:tab w:val="left" w:pos="8148"/>
-        </w:tabs>
-        <w:rPr>
-          <w:rFonts w:ascii="Arial" w:hAnsi="Arial"/>
-          <w:sz w:val="16"/>
-        </w:rPr>
-      </w:pPr>
-      <w:r>
-        <w:rPr>
-          <w:rFonts w:ascii="Arial" w:hAnsi="Arial"/>
-          <w:sz w:val="16"/>
-        </w:rPr>
-        <w:tab/>
-      </w:r>
-    </w:p>
-    <w:p>
-      <w:pPr>
-        <w:rPr>
-          <w:rFonts w:ascii="Arial" w:hAnsi="Arial"/>
-          <w:sz w:val="16"/>
-        </w:rPr>
-      </w:pPr>
-    </w:p>
-    <w:p>
-      <w:pPr>
-        <w:rPr>
-          <w:rFonts w:ascii="Arial" w:hAnsi="Arial"/>
-          <w:sz w:val="16"/>
-        </w:rPr>
-      </w:pPr>
-    </w:p>
-    <w:p>
-      <w:pPr>
-        <w:rPr>
-          <w:rFonts w:ascii="Arial" w:hAnsi="Arial"/>
-          <w:sz w:val="16"/>
-        </w:rPr>
-      </w:pPr>
-    </w:p>
-    <w:p>
-      <w:pPr>
-        <w:rPr>
-          <w:rFonts w:ascii="Arial" w:hAnsi="Arial"/>
-          <w:sz w:val="16"/>
-        </w:rPr>
-      </w:pPr>
-    </w:p>
-    <w:p>
-      <w:pPr>
-        <w:rPr>
-          <w:rFonts w:ascii="Arial" w:hAnsi="Arial"/>
-          <w:sz w:val="16"/>
-        </w:rPr>
-      </w:pPr>
-    </w:p>
-    <w:p>
-      <w:pPr>
-        <w:rPr>
-          <w:rFonts w:ascii="Arial" w:hAnsi="Arial"/>
-          <w:sz w:val="16"/>
-        </w:rPr>
-      </w:pPr>
-    </w:p>
-    <w:p>
-      <w:pPr>
-        <w:rPr>
-          <w:rFonts w:ascii="Arial" w:hAnsi="Arial"/>
           <w:sz w:val="16"/>
         </w:rPr>
       </w:pPr>

</xml_diff>